<commit_message>
Add updated equipment status document and remove temporary file
</commit_message>
<xml_diff>
--- a/equipment_status.docx
+++ b/equipment_status.docx
@@ -11,7 +11,7 @@
           <w:rFonts w:ascii="Arial" w:hAnsi="Arial"/>
           <w:sz w:val="22"/>
         </w:rPr>
-        <w:t>☑  EQ-001</w:t>
+        <w:t>☑  EQ-001 - Amatrol 87-MS1 Pick and Place</w:t>
       </w:r>
     </w:p>
     <w:p>
@@ -23,7 +23,7 @@
           <w:rFonts w:ascii="Arial" w:hAnsi="Arial"/>
           <w:sz w:val="22"/>
         </w:rPr>
-        <w:t>☑  EQ-002</w:t>
+        <w:t>☑  EQ-002 - Amatrol 87-MS2 Gauging Station</w:t>
       </w:r>
     </w:p>
     <w:p>
@@ -35,7 +35,7 @@
           <w:rFonts w:ascii="Arial" w:hAnsi="Arial"/>
           <w:sz w:val="22"/>
         </w:rPr>
-        <w:t>☑  EQ-003</w:t>
+        <w:t>☑  EQ-003 - Amatrol 87-MS7 Inventory Storage</w:t>
       </w:r>
     </w:p>
     <w:p>
@@ -47,7 +47,7 @@
           <w:rFonts w:ascii="Arial" w:hAnsi="Arial"/>
           <w:sz w:val="22"/>
         </w:rPr>
-        <w:t>☑  EQ-004</w:t>
+        <w:t>☑  EQ-004 - Amatrol Smart Robot Workcell</w:t>
       </w:r>
     </w:p>
     <w:p>
@@ -59,7 +59,7 @@
           <w:rFonts w:ascii="Arial" w:hAnsi="Arial"/>
           <w:sz w:val="22"/>
         </w:rPr>
-        <w:t>☑  EQ-005</w:t>
+        <w:t>☑  EQ-005 - B-2 Atomic Force Microscope (AFM)</w:t>
       </w:r>
     </w:p>
     <w:p>
@@ -71,7 +71,7 @@
           <w:rFonts w:ascii="Arial" w:hAnsi="Arial"/>
           <w:sz w:val="22"/>
         </w:rPr>
-        <w:t>☑  EQ-006</w:t>
+        <w:t>☑  EQ-006 - Bambu Lab H2D 3D Printer</w:t>
       </w:r>
     </w:p>
     <w:p>
@@ -83,7 +83,7 @@
           <w:rFonts w:ascii="Arial" w:hAnsi="Arial"/>
           <w:sz w:val="22"/>
         </w:rPr>
-        <w:t>☑  EQ-007</w:t>
+        <w:t>☑  EQ-007 - BELPREP VAC Series</w:t>
       </w:r>
     </w:p>
     <w:p>
@@ -95,7 +95,7 @@
           <w:rFonts w:ascii="Arial" w:hAnsi="Arial"/>
           <w:sz w:val="22"/>
         </w:rPr>
-        <w:t>☑  EQ-008</w:t>
+        <w:t>☑  EQ-008 - BELSORP MAX X Surface and Pore Analyzer</w:t>
       </w:r>
     </w:p>
     <w:p>
@@ -107,7 +107,7 @@
           <w:rFonts w:ascii="Arial" w:hAnsi="Arial"/>
           <w:sz w:val="22"/>
         </w:rPr>
-        <w:t>☑  EQ-009</w:t>
+        <w:t>☑  EQ-009 - CSZ Environmental Chamber</w:t>
       </w:r>
     </w:p>
     <w:p>
@@ -119,7 +119,7 @@
           <w:rFonts w:ascii="Arial" w:hAnsi="Arial"/>
           <w:sz w:val="22"/>
         </w:rPr>
-        <w:t>☑  EQ-010</w:t>
+        <w:t>☑  EQ-010 - Ellipsometer</w:t>
       </w:r>
     </w:p>
     <w:p>
@@ -131,7 +131,7 @@
           <w:rFonts w:ascii="Arial" w:hAnsi="Arial"/>
           <w:sz w:val="22"/>
         </w:rPr>
-        <w:t>☑  EQ-011</w:t>
+        <w:t>☑  EQ-011 - Fluke P3114 Oil Deadweight Tester</w:t>
       </w:r>
     </w:p>
     <w:p>
@@ -143,7 +143,7 @@
           <w:rFonts w:ascii="Arial" w:hAnsi="Arial"/>
           <w:sz w:val="22"/>
         </w:rPr>
-        <w:t>☑  EQ-012</w:t>
+        <w:t>☑  EQ-012 - Haas Desktop Lathe</w:t>
       </w:r>
     </w:p>
     <w:p>
@@ -155,7 +155,7 @@
           <w:rFonts w:ascii="Arial" w:hAnsi="Arial"/>
           <w:sz w:val="22"/>
         </w:rPr>
-        <w:t>☑  EQ-013</w:t>
+        <w:t>☑  EQ-013 - Haas Desktop Mill</w:t>
       </w:r>
     </w:p>
     <w:p>
@@ -167,7 +167,7 @@
           <w:rFonts w:ascii="Arial" w:hAnsi="Arial"/>
           <w:sz w:val="22"/>
         </w:rPr>
-        <w:t>☑  EQ-016</w:t>
+        <w:t>☑  EQ-016 - Keyence VK-X3000 3D Surface Profiler</w:t>
       </w:r>
     </w:p>
     <w:p>
@@ -179,7 +179,7 @@
           <w:rFonts w:ascii="Arial" w:hAnsi="Arial"/>
           <w:sz w:val="22"/>
         </w:rPr>
-        <w:t>☑  EQ-020</w:t>
+        <w:t>☑  EQ-020 - LPKF ProtoLaser R4</w:t>
       </w:r>
     </w:p>
     <w:p>
@@ -191,7 +191,7 @@
           <w:rFonts w:ascii="Arial" w:hAnsi="Arial"/>
           <w:sz w:val="22"/>
         </w:rPr>
-        <w:t>☑  EQ-022</w:t>
+        <w:t>☑  EQ-022 - MPI TS200 Probe Station</w:t>
       </w:r>
     </w:p>
     <w:p>
@@ -203,7 +203,7 @@
           <w:rFonts w:ascii="Arial" w:hAnsi="Arial"/>
           <w:sz w:val="22"/>
         </w:rPr>
-        <w:t>☑  EQ-026</w:t>
+        <w:t>☑  EQ-026 - Photoluminescence Spectrometer</w:t>
       </w:r>
     </w:p>
     <w:p>
@@ -215,7 +215,7 @@
           <w:rFonts w:ascii="Arial" w:hAnsi="Arial"/>
           <w:sz w:val="22"/>
         </w:rPr>
-        <w:t>☑  EQ-027</w:t>
+        <w:t>☑  EQ-027 - Scanning Electron Microscope (SEM)</w:t>
       </w:r>
     </w:p>
     <w:p>
@@ -227,7 +227,7 @@
           <w:rFonts w:ascii="Arial" w:hAnsi="Arial"/>
           <w:sz w:val="22"/>
         </w:rPr>
-        <w:t>☑  EQ-029</w:t>
+        <w:t>☑  EQ-029 - SIMS Workstation</w:t>
       </w:r>
     </w:p>
     <w:p>
@@ -239,7 +239,7 @@
           <w:rFonts w:ascii="Arial" w:hAnsi="Arial"/>
           <w:sz w:val="22"/>
         </w:rPr>
-        <w:t>☑  EQ-031</w:t>
+        <w:t>☑  EQ-031 - SUSS Mask Aligner</w:t>
       </w:r>
     </w:p>
     <w:p>
@@ -251,7 +251,7 @@
           <w:rFonts w:ascii="Arial" w:hAnsi="Arial"/>
           <w:sz w:val="22"/>
         </w:rPr>
-        <w:t>☑  EQ-037</w:t>
+        <w:t>☑  EQ-037 - Transmission Electron Microscope (TEM)</w:t>
       </w:r>
     </w:p>
     <w:p>
@@ -263,7 +263,7 @@
           <w:rFonts w:ascii="Arial" w:hAnsi="Arial"/>
           <w:sz w:val="22"/>
         </w:rPr>
-        <w:t>☑  EQ-038</w:t>
+        <w:t>☑  EQ-038 - Tresky T-4909 Die Bonder</w:t>
       </w:r>
     </w:p>
     <w:p>
@@ -275,7 +275,7 @@
           <w:rFonts w:ascii="Arial" w:hAnsi="Arial"/>
           <w:sz w:val="22"/>
         </w:rPr>
-        <w:t>☑  EQ-041</w:t>
+        <w:t>☑  EQ-041 - West-Bond Wire Bonder</w:t>
       </w:r>
     </w:p>
     <w:p>
@@ -287,7 +287,7 @@
           <w:rFonts w:ascii="Arial" w:hAnsi="Arial"/>
           <w:sz w:val="22"/>
         </w:rPr>
-        <w:t>☑  EQ-042</w:t>
+        <w:t>☑  EQ-042 - XRD (X-Ray Diffraction)</w:t>
       </w:r>
     </w:p>
     <w:p>
@@ -304,7 +304,7 @@
           <w:rFonts w:ascii="Arial" w:hAnsi="Arial"/>
           <w:sz w:val="22"/>
         </w:rPr>
-        <w:t>☐  EQ-014</w:t>
+        <w:t>☐  EQ-014 - Keithley 2110 5.5 Digit Multimeter</w:t>
       </w:r>
     </w:p>
     <w:p>
@@ -316,7 +316,7 @@
           <w:rFonts w:ascii="Arial" w:hAnsi="Arial"/>
           <w:sz w:val="22"/>
         </w:rPr>
-        <w:t>☐  EQ-015</w:t>
+        <w:t>☐  EQ-015 - Keyence VHX-7000 Digital Microscope</w:t>
       </w:r>
     </w:p>
     <w:p>
@@ -328,7 +328,7 @@
           <w:rFonts w:ascii="Arial" w:hAnsi="Arial"/>
           <w:sz w:val="22"/>
         </w:rPr>
-        <w:t>☐  EQ-017</w:t>
+        <w:t>☐  EQ-017 - Keyence WM-6000 Wide Area CMM</w:t>
       </w:r>
     </w:p>
     <w:p>
@@ -340,7 +340,7 @@
           <w:rFonts w:ascii="Arial" w:hAnsi="Arial"/>
           <w:sz w:val="22"/>
         </w:rPr>
-        <w:t>☐  EQ-018</w:t>
+        <w:t>☐  EQ-018 - Keysight E4990A Impedance Analyzer</w:t>
       </w:r>
     </w:p>
     <w:p>
@@ -352,7 +352,7 @@
           <w:rFonts w:ascii="Arial" w:hAnsi="Arial"/>
           <w:sz w:val="22"/>
         </w:rPr>
-        <w:t>☐  EQ-019</w:t>
+        <w:t>☐  EQ-019 - LN2 Storage and Dewars</w:t>
       </w:r>
     </w:p>
     <w:p>
@@ -364,7 +364,7 @@
           <w:rFonts w:ascii="Arial" w:hAnsi="Arial"/>
           <w:sz w:val="22"/>
         </w:rPr>
-        <w:t>☐  EQ-021</w:t>
+        <w:t>☐  EQ-021 - Montana CryoAdvance 50</w:t>
       </w:r>
     </w:p>
     <w:p>
@@ -376,7 +376,7 @@
           <w:rFonts w:ascii="Arial" w:hAnsi="Arial"/>
           <w:sz w:val="22"/>
         </w:rPr>
-        <w:t>☐  EQ-023</w:t>
+        <w:t>☐  EQ-023 - NIL Technology CNI v3.0</w:t>
       </w:r>
     </w:p>
     <w:p>
@@ -388,7 +388,7 @@
           <w:rFonts w:ascii="Arial" w:hAnsi="Arial"/>
           <w:sz w:val="22"/>
         </w:rPr>
-        <w:t>☐  EQ-025</w:t>
+        <w:t>☐  EQ-025 - PELCO FlexScribe 300</w:t>
       </w:r>
     </w:p>
     <w:p>
@@ -400,7 +400,7 @@
           <w:rFonts w:ascii="Arial" w:hAnsi="Arial"/>
           <w:sz w:val="22"/>
         </w:rPr>
-        <w:t>☐  EQ-028</w:t>
+        <w:t>☐  EQ-028 - Seebeck and Resistivity Instrument</w:t>
       </w:r>
     </w:p>
     <w:p>
@@ -412,7 +412,7 @@
           <w:rFonts w:ascii="Arial" w:hAnsi="Arial"/>
           <w:sz w:val="22"/>
         </w:rPr>
-        <w:t>☐  EQ-030</w:t>
+        <w:t>☐  EQ-030 - Spatial Light Modulator</w:t>
       </w:r>
     </w:p>
     <w:p>
@@ -424,7 +424,7 @@
           <w:rFonts w:ascii="Arial" w:hAnsi="Arial"/>
           <w:sz w:val="22"/>
         </w:rPr>
-        <w:t>☐  EQ-032</w:t>
+        <w:t>☐  EQ-032 - Tektronix AFG1022 Function Generator</w:t>
       </w:r>
     </w:p>
     <w:p>
@@ -436,7 +436,7 @@
           <w:rFonts w:ascii="Arial" w:hAnsi="Arial"/>
           <w:sz w:val="22"/>
         </w:rPr>
-        <w:t>☐  EQ-033</w:t>
+        <w:t>☐  EQ-033 - Tektronix TBS1052C Digital Oscilloscope</w:t>
       </w:r>
     </w:p>
     <w:p>
@@ -448,7 +448,7 @@
           <w:rFonts w:ascii="Arial" w:hAnsi="Arial"/>
           <w:sz w:val="22"/>
         </w:rPr>
-        <w:t>☐  EQ-034</w:t>
+        <w:t>☐  EQ-034 - TEM Prep - Dimple Grinder</w:t>
       </w:r>
     </w:p>
     <w:p>
@@ -460,7 +460,7 @@
           <w:rFonts w:ascii="Arial" w:hAnsi="Arial"/>
           <w:sz w:val="22"/>
         </w:rPr>
-        <w:t>☐  EQ-035</w:t>
+        <w:t>☐  EQ-035 - TEM Prep - Disk Grinder</w:t>
       </w:r>
     </w:p>
     <w:p>
@@ -472,7 +472,7 @@
           <w:rFonts w:ascii="Arial" w:hAnsi="Arial"/>
           <w:sz w:val="22"/>
         </w:rPr>
-        <w:t>☐  EQ-036</w:t>
+        <w:t>☐  EQ-036 - TEM Prep - Ion Beam Mill</w:t>
       </w:r>
     </w:p>
     <w:p>
@@ -484,7 +484,7 @@
           <w:rFonts w:ascii="Arial" w:hAnsi="Arial"/>
           <w:sz w:val="22"/>
         </w:rPr>
-        <w:t>☐  EQ-039</w:t>
+        <w:t>☐  EQ-039 - Vector Network Analyzer (VNA)</w:t>
       </w:r>
     </w:p>
     <w:p>
@@ -496,7 +496,7 @@
           <w:rFonts w:ascii="Arial" w:hAnsi="Arial"/>
           <w:sz w:val="22"/>
         </w:rPr>
-        <w:t>☐  EQ-040</w:t>
+        <w:t>☐  EQ-040 - Voltera V-One PCB Printer</w:t>
       </w:r>
     </w:p>
     <w:sectPr>

</xml_diff>